<commit_message>
entrega 2.4 fase 2
</commit_message>
<xml_diff>
--- a/Fase 1/Evidencias Grupales/1.5_GuiaEstudiante_Fase 1_Definicion Proyecto APT (Español).docx
+++ b/Fase 1/Evidencias Grupales/1.5_GuiaEstudiante_Fase 1_Definicion Proyecto APT (Español).docx
@@ -9352,6 +9352,46 @@
         </w:tc>
       </w:tr>
     </w:tbl>
+    <w:p>
+      <w:pPr>
+        <w:rPr/>
+      </w:pPr>
+      <w:r>
+        <w:rPr>
+          <w:rtl w:val="0"/>
+        </w:rPr>
+      </w:r>
+    </w:p>
+    <w:p>
+      <w:pPr>
+        <w:rPr/>
+      </w:pPr>
+      <w:r>
+        <w:rPr>
+          <w:rtl w:val="0"/>
+        </w:rPr>
+      </w:r>
+    </w:p>
+    <w:p>
+      <w:pPr>
+        <w:rPr/>
+      </w:pPr>
+      <w:r>
+        <w:rPr>
+          <w:rtl w:val="0"/>
+        </w:rPr>
+      </w:r>
+    </w:p>
+    <w:p>
+      <w:pPr>
+        <w:rPr/>
+      </w:pPr>
+      <w:r>
+        <w:rPr>
+          <w:rtl w:val="0"/>
+        </w:rPr>
+      </w:r>
+    </w:p>
     <w:p>
       <w:pPr>
         <w:rPr/>

</xml_diff>